<commit_message>
vault backup: 2026-10-29 16:28:53
</commit_message>
<xml_diff>
--- a/Устав/_документы/Regulations on the Project Office for Central Asia.docx
+++ b/Устав/_документы/Regulations on the Project Office for Central Asia.docx
@@ -120,7 +120,7 @@
           <w:szCs w:val="24"/>
           <w:lang w:val="en-GB"/>
         </w:rPr>
-        <w:t>(Minutes No. ___ dated «___» __________ 2026)</w:t>
+        <w:t>(Minutes No. 13 dated 30 October 2026)</w:t>
       </w:r>
     </w:p>
     <w:p>
@@ -224,7 +224,16 @@
           <w:szCs w:val="24"/>
           <w:lang w:val="en-GB"/>
         </w:rPr>
-        <w:t>1.1. The Project Office for Central Asia on Climate Change and Green Energy (hereinafter – the Project Office) is a structural unit of the Private Foundation «Central Asia Climate Foundation» (hereinafter – the Foundation) for the regional and international area of the Foundation's activities. The Foundation was established on 22 February 2024 as the legal form of the Project Office pursuant to the initiative of the Head of State at the 78th session of the UN General Assembly; cooperation within its framework is supported by paragraph 24 of the Declaration of the Regional Environmental Summit (Astana, 2026). It is included in the structure of the Foundation by decision of the Management Council (Minutes No. 13).</w:t>
+        <w:t xml:space="preserve">1.1. The Project Office for Central Asia on Climate Change and Green Energy (hereinafter – the Project Office) is a structural unit of the Private Foundation «Central Asia Climate Foundation» (hereinafter – the Foundation) for the regional and international area of the Foundation's activities. The Foundation was established on 22 February 2024 as the legal form of the Project Office pursuant to the initiative of the Head of State at the 78th session of the UN General Assembly; cooperation within its framework is supported by paragraph 24 of the Declaration of the Regional Environmental Summit (Astana, 2026). It is included in the structure of the Foundation by decision of the </w:t>
+      </w:r>
+      <w:r>
+        <w:rPr>
+          <w:rFonts w:ascii="Times New Roman" w:hAnsi="Times New Roman" w:cs="Times New Roman"/>
+          <w:sz w:val="21"/>
+          <w:szCs w:val="24"/>
+          <w:lang w:val="en-GB"/>
+        </w:rPr>
+        <w:t>Management Council (Minutes No. 13 dated 30 October 2026).</w:t>
       </w:r>
     </w:p>
     <w:p>

</xml_diff>